<commit_message>
fix template bracket bug
</commit_message>
<xml_diff>
--- a/templates/rent_exclusive.docx
+++ b/templates/rent_exclusive.docx
@@ -16,6 +16,16 @@
         </w:rPr>
       </w:pPr>
       <w:bookmarkStart w:id="0" w:name="_Hlk187832515"/>
+      <w:r>
+        <w:rPr>
+          <w:rFonts w:ascii="Times New Roman" w:hAnsi="Times New Roman" w:cs="Times New Roman"/>
+          <w:b/>
+          <w:bCs/>
+          <w:sz w:val="20"/>
+          <w:szCs w:val="20"/>
+        </w:rPr>
+        <w:t>}}</w:t>
+      </w:r>
       <w:r>
         <w:rPr>
           <w:rFonts w:ascii="Times New Roman" w:hAnsi="Times New Roman" w:cs="Times New Roman"/>
@@ -285,25 +295,23 @@
           <w:sz w:val="20"/>
           <w:szCs w:val="20"/>
         </w:rPr>
-        <w:t>{{</w:t>
-      </w:r>
-      <w:proofErr w:type="spellStart"/>
+        <w:t>{{startDate</w:t>
+      </w:r>
       <w:r>
         <w:rPr>
           <w:rFonts w:ascii="Times New Roman" w:hAnsi="Times New Roman" w:cs="Times New Roman"/>
           <w:sz w:val="20"/>
           <w:szCs w:val="20"/>
         </w:rPr>
-        <w:t>startDate</w:t>
-      </w:r>
-      <w:proofErr w:type="spellEnd"/>
+        <w:t>}}</w:t>
+      </w:r>
       <w:r>
         <w:rPr>
           <w:rFonts w:ascii="Times New Roman" w:hAnsi="Times New Roman" w:cs="Times New Roman"/>
           <w:sz w:val="20"/>
           <w:szCs w:val="20"/>
         </w:rPr>
-        <w:t>}}-</w:t>
+        <w:t>-</w:t>
       </w:r>
       <w:r>
         <w:rPr>
@@ -321,9 +329,8 @@
           <w:szCs w:val="20"/>
           <w:lang w:val="mn-MN"/>
         </w:rPr>
-        <w:t xml:space="preserve">                           </w:t>
-      </w:r>
-      <w:proofErr w:type="gramStart"/>
+        <w:t xml:space="preserve">                             </w:t>
+      </w:r>
       <w:r>
         <w:rPr>
           <w:rFonts w:ascii="Times New Roman" w:hAnsi="Times New Roman" w:cs="Times New Roman"/>
@@ -331,90 +338,103 @@
           <w:szCs w:val="20"/>
           <w:lang w:val="mn-MN"/>
         </w:rPr>
-        <w:t xml:space="preserve">  </w:t>
+        <w:t xml:space="preserve"> </w:t>
+      </w:r>
+      <w:r>
+        <w:rPr>
+          <w:rFonts w:ascii="Times New Roman" w:hAnsi="Times New Roman" w:cs="Times New Roman"/>
+          <w:bCs/>
+          <w:lang w:val="mn-MN"/>
+        </w:rPr>
+        <w:t>{{contractNumber</w:t>
+      </w:r>
+      <w:r>
+        <w:rPr>
+          <w:rFonts w:ascii="Times New Roman" w:hAnsi="Times New Roman" w:cs="Times New Roman"/>
+          <w:bCs/>
+          <w:lang w:val="mn-MN"/>
+        </w:rPr>
+        <w:t>}}</w:t>
+      </w:r>
+      <w:r>
+        <w:rPr>
+          <w:rFonts w:ascii="Times New Roman" w:hAnsi="Times New Roman" w:cs="Times New Roman"/>
+          <w:bCs/>
+          <w:lang w:val="mn-MN"/>
+        </w:rPr>
+        <w:t xml:space="preserve"> </w:t>
+      </w:r>
+      <w:r>
+        <w:rPr>
+          <w:rFonts w:ascii="Times New Roman" w:hAnsi="Times New Roman" w:cs="Times New Roman"/>
+          <w:bCs/>
+          <w:lang w:val="mn-MN"/>
+        </w:rPr>
+        <w:tab/>
+      </w:r>
+      <w:r>
+        <w:rPr>
+          <w:rFonts w:ascii="Times New Roman" w:hAnsi="Times New Roman" w:cs="Times New Roman"/>
+          <w:bCs/>
+          <w:lang w:val="mn-MN"/>
+        </w:rPr>
+        <w:tab/>
+      </w:r>
+      <w:r>
+        <w:rPr>
+          <w:rFonts w:ascii="Times New Roman" w:hAnsi="Times New Roman" w:cs="Times New Roman"/>
+          <w:bCs/>
+          <w:lang w:val="mn-MN"/>
+        </w:rPr>
+        <w:tab/>
+      </w:r>
+      <w:r>
+        <w:rPr>
+          <w:rFonts w:ascii="Times New Roman" w:hAnsi="Times New Roman" w:cs="Times New Roman"/>
+          <w:bCs/>
+          <w:lang w:val="mn-MN"/>
+        </w:rPr>
+        <w:tab/>
+      </w:r>
+      <w:r>
+        <w:rPr>
+          <w:rFonts w:ascii="Times New Roman" w:hAnsi="Times New Roman" w:cs="Times New Roman"/>
+          <w:bCs/>
+          <w:lang w:val="mn-MN"/>
+        </w:rPr>
+        <w:t>Улаанбаатар хот</w:t>
+      </w:r>
+      <w:r>
+        <w:rPr>
+          <w:rFonts w:ascii="Times New Roman" w:hAnsi="Times New Roman" w:cs="Times New Roman"/>
+          <w:bCs/>
+          <w:lang w:val="mn-MN"/>
+        </w:rPr>
+        <w:tab/>
+      </w:r>
+      <w:r>
+        <w:rPr>
+          <w:rFonts w:ascii="Times New Roman" w:hAnsi="Times New Roman" w:cs="Times New Roman"/>
+          <w:bCs/>
+          <w:lang w:val="mn-MN"/>
+        </w:rPr>
+        <w:tab/>
+      </w:r>
+      <w:r>
+        <w:rPr>
+          <w:rFonts w:ascii="Times New Roman" w:hAnsi="Times New Roman" w:cs="Times New Roman"/>
+          <w:bCs/>
+          <w:lang w:val="mn-MN"/>
+        </w:rPr>
+        <w:tab/>
       </w:r>
       <w:r>
         <w:rPr>
           <w:rFonts w:ascii="Times New Roman" w:hAnsi="Times New Roman" w:cs="Times New Roman"/>
           <w:sz w:val="20"/>
           <w:szCs w:val="20"/>
-          <w:lang w:val="mn-MN"/>
         </w:rPr>
         <w:t xml:space="preserve"> </w:t>
-      </w:r>
-      <w:r>
-        <w:rPr>
-          <w:rFonts w:ascii="Times New Roman" w:hAnsi="Times New Roman" w:cs="Times New Roman"/>
-          <w:bCs/>
-          <w:lang w:val="mn-MN"/>
-        </w:rPr>
-        <w:t>{</w:t>
-      </w:r>
-      <w:proofErr w:type="gramEnd"/>
-      <w:r>
-        <w:rPr>
-          <w:rFonts w:ascii="Times New Roman" w:hAnsi="Times New Roman" w:cs="Times New Roman"/>
-          <w:bCs/>
-          <w:lang w:val="mn-MN"/>
-        </w:rPr>
-        <w:t>{contractNumber}}</w:t>
-      </w:r>
-      <w:r>
-        <w:rPr>
-          <w:rFonts w:ascii="Times New Roman" w:hAnsi="Times New Roman" w:cs="Times New Roman"/>
-          <w:bCs/>
-          <w:lang w:val="mn-MN"/>
-        </w:rPr>
-        <w:t xml:space="preserve"> </w:t>
-      </w:r>
-      <w:r>
-        <w:rPr>
-          <w:rFonts w:ascii="Times New Roman" w:hAnsi="Times New Roman" w:cs="Times New Roman"/>
-          <w:bCs/>
-          <w:lang w:val="mn-MN"/>
-        </w:rPr>
-        <w:tab/>
-      </w:r>
-      <w:r>
-        <w:rPr>
-          <w:rFonts w:ascii="Times New Roman" w:hAnsi="Times New Roman" w:cs="Times New Roman"/>
-          <w:bCs/>
-          <w:lang w:val="mn-MN"/>
-        </w:rPr>
-        <w:tab/>
-      </w:r>
-      <w:r>
-        <w:rPr>
-          <w:rFonts w:ascii="Times New Roman" w:hAnsi="Times New Roman" w:cs="Times New Roman"/>
-          <w:bCs/>
-          <w:lang w:val="mn-MN"/>
-        </w:rPr>
-        <w:tab/>
-      </w:r>
-      <w:r>
-        <w:rPr>
-          <w:rFonts w:ascii="Times New Roman" w:hAnsi="Times New Roman" w:cs="Times New Roman"/>
-          <w:bCs/>
-          <w:lang w:val="mn-MN"/>
-        </w:rPr>
-        <w:tab/>
-      </w:r>
-      <w:r>
-        <w:rPr>
-          <w:rFonts w:ascii="Times New Roman" w:hAnsi="Times New Roman" w:cs="Times New Roman"/>
-          <w:sz w:val="20"/>
-          <w:szCs w:val="20"/>
-          <w:lang w:val="mn-MN"/>
-        </w:rPr>
-        <w:t>Улаанбаатар хот</w:t>
-      </w:r>
-      <w:r>
-        <w:rPr>
-          <w:rFonts w:ascii="Times New Roman" w:hAnsi="Times New Roman" w:cs="Times New Roman"/>
-          <w:sz w:val="20"/>
-          <w:szCs w:val="20"/>
-        </w:rPr>
-        <w:t xml:space="preserve">            </w:t>
       </w:r>
     </w:p>
     <w:tbl>
@@ -566,123 +586,13 @@
                 <w:lang w:val="mn-MN"/>
               </w:rPr>
             </w:pPr>
-            <w:proofErr w:type="spellStart"/>
             <w:r>
               <w:rPr>
                 <w:rFonts w:ascii="Times New Roman" w:hAnsi="Times New Roman" w:cs="Times New Roman"/>
                 <w:sz w:val="20"/>
                 <w:szCs w:val="20"/>
               </w:rPr>
-              <w:t>Хуулийн</w:t>
-            </w:r>
-            <w:proofErr w:type="spellEnd"/>
-            <w:r>
-              <w:rPr>
-                <w:rFonts w:ascii="Times New Roman" w:hAnsi="Times New Roman" w:cs="Times New Roman"/>
-                <w:sz w:val="20"/>
-                <w:szCs w:val="20"/>
-              </w:rPr>
-              <w:t xml:space="preserve"> </w:t>
-            </w:r>
-            <w:proofErr w:type="spellStart"/>
-            <w:r>
-              <w:rPr>
-                <w:rFonts w:ascii="Times New Roman" w:hAnsi="Times New Roman" w:cs="Times New Roman"/>
-                <w:sz w:val="20"/>
-                <w:szCs w:val="20"/>
-              </w:rPr>
-              <w:t>этгээдийн</w:t>
-            </w:r>
-            <w:proofErr w:type="spellEnd"/>
-            <w:r>
-              <w:rPr>
-                <w:rFonts w:ascii="Times New Roman" w:hAnsi="Times New Roman" w:cs="Times New Roman"/>
-                <w:sz w:val="20"/>
-                <w:szCs w:val="20"/>
-              </w:rPr>
-              <w:t xml:space="preserve"> </w:t>
-            </w:r>
-            <w:proofErr w:type="spellStart"/>
-            <w:r>
-              <w:rPr>
-                <w:rFonts w:ascii="Times New Roman" w:hAnsi="Times New Roman" w:cs="Times New Roman"/>
-                <w:sz w:val="20"/>
-                <w:szCs w:val="20"/>
-              </w:rPr>
-              <w:t>нэр</w:t>
-            </w:r>
-            <w:proofErr w:type="spellEnd"/>
-            <w:r>
-              <w:rPr>
-                <w:rFonts w:ascii="Times New Roman" w:hAnsi="Times New Roman" w:cs="Times New Roman"/>
-                <w:sz w:val="20"/>
-                <w:szCs w:val="20"/>
-              </w:rPr>
-              <w:t>…………………</w:t>
-            </w:r>
-            <w:proofErr w:type="gramStart"/>
-            <w:r>
-              <w:rPr>
-                <w:rFonts w:ascii="Times New Roman" w:hAnsi="Times New Roman" w:cs="Times New Roman"/>
-                <w:sz w:val="20"/>
-                <w:szCs w:val="20"/>
-              </w:rPr>
-              <w:t>…..</w:t>
-            </w:r>
-            <w:proofErr w:type="spellStart"/>
-            <w:proofErr w:type="gramEnd"/>
-            <w:r>
-              <w:rPr>
-                <w:rFonts w:ascii="Times New Roman" w:hAnsi="Times New Roman" w:cs="Times New Roman"/>
-                <w:sz w:val="20"/>
-                <w:szCs w:val="20"/>
-              </w:rPr>
-              <w:t>түүнийг</w:t>
-            </w:r>
-            <w:proofErr w:type="spellEnd"/>
-            <w:r>
-              <w:rPr>
-                <w:rFonts w:ascii="Times New Roman" w:hAnsi="Times New Roman" w:cs="Times New Roman"/>
-                <w:sz w:val="20"/>
-                <w:szCs w:val="20"/>
-              </w:rPr>
-              <w:t xml:space="preserve"> </w:t>
-            </w:r>
-            <w:proofErr w:type="spellStart"/>
-            <w:r>
-              <w:rPr>
-                <w:rFonts w:ascii="Times New Roman" w:hAnsi="Times New Roman" w:cs="Times New Roman"/>
-                <w:sz w:val="20"/>
-                <w:szCs w:val="20"/>
-              </w:rPr>
-              <w:t>төлөөлөн</w:t>
-            </w:r>
-            <w:proofErr w:type="spellEnd"/>
-            <w:r>
-              <w:rPr>
-                <w:rFonts w:ascii="Times New Roman" w:hAnsi="Times New Roman" w:cs="Times New Roman"/>
-                <w:sz w:val="20"/>
-                <w:szCs w:val="20"/>
-              </w:rPr>
-              <w:t xml:space="preserve"> </w:t>
-            </w:r>
-            <w:proofErr w:type="spellStart"/>
-            <w:r>
-              <w:rPr>
-                <w:rFonts w:ascii="Times New Roman" w:hAnsi="Times New Roman" w:cs="Times New Roman"/>
-                <w:sz w:val="20"/>
-                <w:szCs w:val="20"/>
-              </w:rPr>
-              <w:t>Захирал</w:t>
-            </w:r>
-            <w:proofErr w:type="spellEnd"/>
-            <w:r>
-              <w:rPr>
-                <w:rFonts w:ascii="Times New Roman" w:hAnsi="Times New Roman" w:cs="Times New Roman"/>
-                <w:sz w:val="20"/>
-                <w:szCs w:val="20"/>
-              </w:rPr>
-              <w:t>/</w:t>
+              <w:t>Хуулийн этгээдийн нэр……………………..түүнийг төлөөлөн Захирал/</w:t>
             </w:r>
             <w:r>
               <w:rPr>
@@ -748,41 +658,13 @@
                 <w:szCs w:val="20"/>
               </w:rPr>
             </w:pPr>
-            <w:proofErr w:type="spellStart"/>
             <w:r>
               <w:rPr>
                 <w:rFonts w:ascii="Times New Roman" w:hAnsi="Times New Roman" w:cs="Times New Roman"/>
                 <w:sz w:val="20"/>
                 <w:szCs w:val="20"/>
               </w:rPr>
-              <w:t>Регистрийн</w:t>
-            </w:r>
-            <w:proofErr w:type="spellEnd"/>
-            <w:r>
-              <w:rPr>
-                <w:rFonts w:ascii="Times New Roman" w:hAnsi="Times New Roman" w:cs="Times New Roman"/>
-                <w:sz w:val="20"/>
-                <w:szCs w:val="20"/>
-              </w:rPr>
-              <w:t xml:space="preserve"> </w:t>
-            </w:r>
-            <w:proofErr w:type="spellStart"/>
-            <w:r>
-              <w:rPr>
-                <w:rFonts w:ascii="Times New Roman" w:hAnsi="Times New Roman" w:cs="Times New Roman"/>
-                <w:sz w:val="20"/>
-                <w:szCs w:val="20"/>
-              </w:rPr>
-              <w:t>дугаар</w:t>
-            </w:r>
-            <w:proofErr w:type="spellEnd"/>
-            <w:r>
-              <w:rPr>
-                <w:rFonts w:ascii="Times New Roman" w:hAnsi="Times New Roman" w:cs="Times New Roman"/>
-                <w:sz w:val="20"/>
-                <w:szCs w:val="20"/>
-              </w:rPr>
-              <w:t>: 6764924</w:t>
+              <w:t>Регистрийн дугаар: 6764924</w:t>
             </w:r>
           </w:p>
           <w:p>
@@ -802,61 +684,7 @@
                 <w:sz w:val="20"/>
                 <w:szCs w:val="20"/>
               </w:rPr>
-              <w:t>“</w:t>
-            </w:r>
-            <w:proofErr w:type="spellStart"/>
-            <w:r>
-              <w:rPr>
-                <w:rFonts w:ascii="Times New Roman" w:hAnsi="Times New Roman" w:cs="Times New Roman"/>
-                <w:sz w:val="20"/>
-                <w:szCs w:val="20"/>
-              </w:rPr>
-              <w:t>Ап</w:t>
-            </w:r>
-            <w:proofErr w:type="spellEnd"/>
-            <w:r>
-              <w:rPr>
-                <w:rFonts w:ascii="Times New Roman" w:hAnsi="Times New Roman" w:cs="Times New Roman"/>
-                <w:sz w:val="20"/>
-                <w:szCs w:val="20"/>
-              </w:rPr>
-              <w:t xml:space="preserve"> </w:t>
-            </w:r>
-            <w:proofErr w:type="spellStart"/>
-            <w:r>
-              <w:rPr>
-                <w:rFonts w:ascii="Times New Roman" w:hAnsi="Times New Roman" w:cs="Times New Roman"/>
-                <w:sz w:val="20"/>
-                <w:szCs w:val="20"/>
-              </w:rPr>
-              <w:t>проперти</w:t>
-            </w:r>
-            <w:proofErr w:type="spellEnd"/>
-            <w:r>
-              <w:rPr>
-                <w:rFonts w:ascii="Times New Roman" w:hAnsi="Times New Roman" w:cs="Times New Roman"/>
-                <w:sz w:val="20"/>
-                <w:szCs w:val="20"/>
-              </w:rPr>
-              <w:t xml:space="preserve"> </w:t>
-            </w:r>
-            <w:proofErr w:type="spellStart"/>
-            <w:r>
-              <w:rPr>
-                <w:rFonts w:ascii="Times New Roman" w:hAnsi="Times New Roman" w:cs="Times New Roman"/>
-                <w:sz w:val="20"/>
-                <w:szCs w:val="20"/>
-              </w:rPr>
-              <w:t>девелопмент</w:t>
-            </w:r>
-            <w:proofErr w:type="spellEnd"/>
-            <w:r>
-              <w:rPr>
-                <w:rFonts w:ascii="Times New Roman" w:hAnsi="Times New Roman" w:cs="Times New Roman"/>
-                <w:sz w:val="20"/>
-                <w:szCs w:val="20"/>
-              </w:rPr>
-              <w:t>” ХХК-</w:t>
+              <w:t>“Ап проперти девелопмент” ХХК-</w:t>
             </w:r>
             <w:r>
               <w:rPr>
@@ -943,7 +771,16 @@
                 <w:szCs w:val="20"/>
                 <w:lang w:val="mn-MN"/>
               </w:rPr>
-              <w:t>{agent}}</w:t>
+              <w:t>{agent</w:t>
+            </w:r>
+            <w:r>
+              <w:rPr>
+                <w:rFonts w:ascii="Times New Roman" w:hAnsi="Times New Roman" w:cs="Times New Roman"/>
+                <w:sz w:val="20"/>
+                <w:szCs w:val="20"/>
+                <w:lang w:val="mn-MN"/>
+              </w:rPr>
+              <w:t>}}</w:t>
             </w:r>
             <w:r>
               <w:rPr>
@@ -969,17 +806,7 @@
                 <w:szCs w:val="20"/>
                 <w:lang w:val="mn-MN"/>
               </w:rPr>
-              <w:t xml:space="preserve">цаашид “Зуучлагч” </w:t>
-            </w:r>
-            <w:proofErr w:type="gramStart"/>
-            <w:r>
-              <w:rPr>
-                <w:rFonts w:ascii="Times New Roman" w:hAnsi="Times New Roman" w:cs="Times New Roman"/>
-                <w:sz w:val="20"/>
-                <w:szCs w:val="20"/>
-                <w:lang w:val="mn-MN"/>
-              </w:rPr>
-              <w:t xml:space="preserve">гэх </w:t>
+              <w:t xml:space="preserve">цаашид “Зуучлагч” гэх </w:t>
             </w:r>
             <w:r>
               <w:rPr>
@@ -987,16 +814,7 @@
                 <w:sz w:val="20"/>
                 <w:szCs w:val="20"/>
               </w:rPr>
-              <w:t>)</w:t>
-            </w:r>
-            <w:proofErr w:type="gramEnd"/>
-            <w:r>
-              <w:rPr>
-                <w:rFonts w:ascii="Times New Roman" w:hAnsi="Times New Roman" w:cs="Times New Roman"/>
-                <w:sz w:val="20"/>
-                <w:szCs w:val="20"/>
-              </w:rPr>
-              <w:t xml:space="preserve"> </w:t>
+              <w:t xml:space="preserve">) </w:t>
             </w:r>
             <w:r>
               <w:rPr>
@@ -1028,7 +846,6 @@
                 <w:szCs w:val="20"/>
               </w:rPr>
             </w:pPr>
-            <w:proofErr w:type="spellStart"/>
             <w:r>
               <w:rPr>
                 <w:rFonts w:ascii="Times New Roman" w:hAnsi="Times New Roman" w:cs="Times New Roman"/>
@@ -1037,7 +854,6 @@
               </w:rPr>
               <w:t>Иргэн</w:t>
             </w:r>
-            <w:proofErr w:type="spellEnd"/>
           </w:p>
         </w:tc>
         <w:tc>
@@ -1059,7 +875,23 @@
                 <w:sz w:val="20"/>
                 <w:szCs w:val="20"/>
               </w:rPr>
-              <w:t xml:space="preserve">{{name}} </w:t>
+              <w:t>{{name</w:t>
+            </w:r>
+            <w:r>
+              <w:rPr>
+                <w:rFonts w:ascii="Times New Roman" w:hAnsi="Times New Roman" w:cs="Times New Roman"/>
+                <w:sz w:val="20"/>
+                <w:szCs w:val="20"/>
+              </w:rPr>
+              <w:t>}}</w:t>
+            </w:r>
+            <w:r>
+              <w:rPr>
+                <w:rFonts w:ascii="Times New Roman" w:hAnsi="Times New Roman" w:cs="Times New Roman"/>
+                <w:sz w:val="20"/>
+                <w:szCs w:val="20"/>
+              </w:rPr>
+              <w:t xml:space="preserve"> </w:t>
             </w:r>
           </w:p>
           <w:p>
@@ -1087,7 +919,7 @@
                 <w:szCs w:val="20"/>
                 <w:lang w:val="mn-MN"/>
               </w:rPr>
-              <w:t>РД: ...........................</w:t>
+              <w:t xml:space="preserve">РД: </w:t>
             </w:r>
             <w:r>
               <w:rPr>
@@ -1095,7 +927,15 @@
                 <w:sz w:val="20"/>
                 <w:szCs w:val="20"/>
               </w:rPr>
-              <w:t>{{register}}</w:t>
+              <w:t>{{register</w:t>
+            </w:r>
+            <w:r>
+              <w:rPr>
+                <w:rFonts w:ascii="Times New Roman" w:hAnsi="Times New Roman" w:cs="Times New Roman"/>
+                <w:sz w:val="20"/>
+                <w:szCs w:val="20"/>
+              </w:rPr>
+              <w:t>}}</w:t>
             </w:r>
             <w:r>
               <w:rPr>
@@ -1180,151 +1020,7 @@
                 <w:sz w:val="20"/>
                 <w:szCs w:val="20"/>
               </w:rPr>
-              <w:t>(</w:t>
-            </w:r>
-            <w:proofErr w:type="spellStart"/>
-            <w:r>
-              <w:rPr>
-                <w:rFonts w:ascii="Times New Roman" w:hAnsi="Times New Roman" w:cs="Times New Roman"/>
-                <w:sz w:val="20"/>
-                <w:szCs w:val="20"/>
-              </w:rPr>
-              <w:t>Зуучлуулагч</w:t>
-            </w:r>
-            <w:proofErr w:type="spellEnd"/>
-            <w:r>
-              <w:rPr>
-                <w:rFonts w:ascii="Times New Roman" w:hAnsi="Times New Roman" w:cs="Times New Roman"/>
-                <w:sz w:val="20"/>
-                <w:szCs w:val="20"/>
-              </w:rPr>
-              <w:t xml:space="preserve"> </w:t>
-            </w:r>
-            <w:proofErr w:type="spellStart"/>
-            <w:r>
-              <w:rPr>
-                <w:rFonts w:ascii="Times New Roman" w:hAnsi="Times New Roman" w:cs="Times New Roman"/>
-                <w:sz w:val="20"/>
-                <w:szCs w:val="20"/>
-              </w:rPr>
-              <w:t>болон</w:t>
-            </w:r>
-            <w:proofErr w:type="spellEnd"/>
-            <w:r>
-              <w:rPr>
-                <w:rFonts w:ascii="Times New Roman" w:hAnsi="Times New Roman" w:cs="Times New Roman"/>
-                <w:sz w:val="20"/>
-                <w:szCs w:val="20"/>
-              </w:rPr>
-              <w:t xml:space="preserve"> </w:t>
-            </w:r>
-            <w:proofErr w:type="spellStart"/>
-            <w:r>
-              <w:rPr>
-                <w:rFonts w:ascii="Times New Roman" w:hAnsi="Times New Roman" w:cs="Times New Roman"/>
-                <w:sz w:val="20"/>
-                <w:szCs w:val="20"/>
-              </w:rPr>
-              <w:t>зуучлагч</w:t>
-            </w:r>
-            <w:proofErr w:type="spellEnd"/>
-            <w:r>
-              <w:rPr>
-                <w:rFonts w:ascii="Times New Roman" w:hAnsi="Times New Roman" w:cs="Times New Roman"/>
-                <w:sz w:val="20"/>
-                <w:szCs w:val="20"/>
-              </w:rPr>
-              <w:t xml:space="preserve"> </w:t>
-            </w:r>
-            <w:proofErr w:type="spellStart"/>
-            <w:r>
-              <w:rPr>
-                <w:rFonts w:ascii="Times New Roman" w:hAnsi="Times New Roman" w:cs="Times New Roman"/>
-                <w:sz w:val="20"/>
-                <w:szCs w:val="20"/>
-              </w:rPr>
-              <w:t>нарыг</w:t>
-            </w:r>
-            <w:proofErr w:type="spellEnd"/>
-            <w:r>
-              <w:rPr>
-                <w:rFonts w:ascii="Times New Roman" w:hAnsi="Times New Roman" w:cs="Times New Roman"/>
-                <w:sz w:val="20"/>
-                <w:szCs w:val="20"/>
-              </w:rPr>
-              <w:t xml:space="preserve"> </w:t>
-            </w:r>
-            <w:proofErr w:type="spellStart"/>
-            <w:r>
-              <w:rPr>
-                <w:rFonts w:ascii="Times New Roman" w:hAnsi="Times New Roman" w:cs="Times New Roman"/>
-                <w:sz w:val="20"/>
-                <w:szCs w:val="20"/>
-              </w:rPr>
-              <w:t>хамтад</w:t>
-            </w:r>
-            <w:proofErr w:type="spellEnd"/>
-            <w:r>
-              <w:rPr>
-                <w:rFonts w:ascii="Times New Roman" w:hAnsi="Times New Roman" w:cs="Times New Roman"/>
-                <w:sz w:val="20"/>
-                <w:szCs w:val="20"/>
-              </w:rPr>
-              <w:t xml:space="preserve"> </w:t>
-            </w:r>
-            <w:proofErr w:type="spellStart"/>
-            <w:r>
-              <w:rPr>
-                <w:rFonts w:ascii="Times New Roman" w:hAnsi="Times New Roman" w:cs="Times New Roman"/>
-                <w:sz w:val="20"/>
-                <w:szCs w:val="20"/>
-              </w:rPr>
-              <w:t>нь</w:t>
-            </w:r>
-            <w:proofErr w:type="spellEnd"/>
-            <w:r>
-              <w:rPr>
-                <w:rFonts w:ascii="Times New Roman" w:hAnsi="Times New Roman" w:cs="Times New Roman"/>
-                <w:sz w:val="20"/>
-                <w:szCs w:val="20"/>
-              </w:rPr>
-              <w:t xml:space="preserve"> “</w:t>
-            </w:r>
-            <w:proofErr w:type="spellStart"/>
-            <w:r>
-              <w:rPr>
-                <w:rFonts w:ascii="Times New Roman" w:hAnsi="Times New Roman" w:cs="Times New Roman"/>
-                <w:sz w:val="20"/>
-                <w:szCs w:val="20"/>
-              </w:rPr>
-              <w:t>Талууд</w:t>
-            </w:r>
-            <w:proofErr w:type="spellEnd"/>
-            <w:r>
-              <w:rPr>
-                <w:rFonts w:ascii="Times New Roman" w:hAnsi="Times New Roman" w:cs="Times New Roman"/>
-                <w:sz w:val="20"/>
-                <w:szCs w:val="20"/>
-              </w:rPr>
-              <w:t xml:space="preserve">” </w:t>
-            </w:r>
-            <w:proofErr w:type="spellStart"/>
-            <w:r>
-              <w:rPr>
-                <w:rFonts w:ascii="Times New Roman" w:hAnsi="Times New Roman" w:cs="Times New Roman"/>
-                <w:sz w:val="20"/>
-                <w:szCs w:val="20"/>
-              </w:rPr>
-              <w:t>гэнэ</w:t>
-            </w:r>
-            <w:proofErr w:type="spellEnd"/>
-            <w:r>
-              <w:rPr>
-                <w:rFonts w:ascii="Times New Roman" w:hAnsi="Times New Roman" w:cs="Times New Roman"/>
-                <w:sz w:val="20"/>
-                <w:szCs w:val="20"/>
-              </w:rPr>
-              <w:t xml:space="preserve">) </w:t>
+              <w:t xml:space="preserve">(Зуучлуулагч болон зуучлагч нарыг хамтад нь “Талууд” гэнэ) </w:t>
             </w:r>
             <w:r>
               <w:rPr>
@@ -1507,7 +1203,6 @@
                 <w:szCs w:val="20"/>
               </w:rPr>
             </w:pPr>
-            <w:proofErr w:type="spellStart"/>
             <w:r>
               <w:rPr>
                 <w:rFonts w:ascii="Times New Roman" w:hAnsi="Times New Roman" w:cs="Times New Roman"/>
@@ -1516,25 +1211,14 @@
               </w:rPr>
               <w:t>Ашиглалтанд</w:t>
             </w:r>
-            <w:proofErr w:type="spellEnd"/>
             <w:r>
               <w:rPr>
                 <w:rFonts w:ascii="Times New Roman" w:hAnsi="Times New Roman" w:cs="Times New Roman"/>
                 <w:sz w:val="20"/>
                 <w:szCs w:val="20"/>
               </w:rPr>
-              <w:t xml:space="preserve"> </w:t>
+              <w:t xml:space="preserve"> орсон</w:t>
             </w:r>
-            <w:proofErr w:type="spellStart"/>
-            <w:r>
-              <w:rPr>
-                <w:rFonts w:ascii="Times New Roman" w:hAnsi="Times New Roman" w:cs="Times New Roman"/>
-                <w:sz w:val="20"/>
-                <w:szCs w:val="20"/>
-              </w:rPr>
-              <w:t>орсон</w:t>
-            </w:r>
-            <w:proofErr w:type="spellEnd"/>
           </w:p>
         </w:tc>
         <w:tc>
@@ -1551,34 +1235,14 @@
                 <w:szCs w:val="20"/>
               </w:rPr>
             </w:pPr>
-            <w:proofErr w:type="spellStart"/>
             <w:r>
               <w:rPr>
                 <w:rFonts w:ascii="Times New Roman" w:hAnsi="Times New Roman" w:cs="Times New Roman"/>
                 <w:sz w:val="20"/>
                 <w:szCs w:val="20"/>
               </w:rPr>
-              <w:t>Талбайн</w:t>
+              <w:t>Талбайн зориулалт</w:t>
             </w:r>
-            <w:proofErr w:type="spellEnd"/>
-            <w:r>
-              <w:rPr>
-                <w:rFonts w:ascii="Times New Roman" w:hAnsi="Times New Roman" w:cs="Times New Roman"/>
-                <w:sz w:val="20"/>
-                <w:szCs w:val="20"/>
-              </w:rPr>
-              <w:t xml:space="preserve"> </w:t>
-            </w:r>
-            <w:proofErr w:type="spellStart"/>
-            <w:r>
-              <w:rPr>
-                <w:rFonts w:ascii="Times New Roman" w:hAnsi="Times New Roman" w:cs="Times New Roman"/>
-                <w:sz w:val="20"/>
-                <w:szCs w:val="20"/>
-              </w:rPr>
-              <w:t>зориулалт</w:t>
-            </w:r>
-            <w:proofErr w:type="spellEnd"/>
           </w:p>
         </w:tc>
       </w:tr>
@@ -1606,7 +1270,15 @@
                 <w:sz w:val="20"/>
                 <w:szCs w:val="20"/>
               </w:rPr>
-              <w:t>{{cert}}</w:t>
+              <w:t>{{cert</w:t>
+            </w:r>
+            <w:r>
+              <w:rPr>
+                <w:rFonts w:ascii="Times New Roman" w:hAnsi="Times New Roman" w:cs="Times New Roman"/>
+                <w:sz w:val="20"/>
+                <w:szCs w:val="20"/>
+              </w:rPr>
+              <w:t>}}</w:t>
             </w:r>
           </w:p>
           <w:p>
@@ -1658,7 +1330,6 @@
                 <w:szCs w:val="20"/>
               </w:rPr>
             </w:pPr>
-            <w:proofErr w:type="spellStart"/>
             <w:r>
               <w:rPr>
                 <w:rFonts w:ascii="Times New Roman" w:hAnsi="Times New Roman" w:cs="Times New Roman"/>
@@ -1667,7 +1338,6 @@
               </w:rPr>
               <w:t>Он</w:t>
             </w:r>
-            <w:proofErr w:type="spellEnd"/>
           </w:p>
         </w:tc>
         <w:tc>
@@ -1690,7 +1360,15 @@
                 <w:sz w:val="20"/>
                 <w:szCs w:val="20"/>
               </w:rPr>
-              <w:t>{{purpose}}</w:t>
+              <w:t>{{purpose</w:t>
+            </w:r>
+            <w:r>
+              <w:rPr>
+                <w:rFonts w:ascii="Times New Roman" w:hAnsi="Times New Roman" w:cs="Times New Roman"/>
+                <w:sz w:val="20"/>
+                <w:szCs w:val="20"/>
+              </w:rPr>
+              <w:t>}}</w:t>
             </w:r>
           </w:p>
         </w:tc>
@@ -1714,7 +1392,6 @@
                 <w:szCs w:val="20"/>
               </w:rPr>
             </w:pPr>
-            <w:proofErr w:type="spellStart"/>
             <w:r>
               <w:rPr>
                 <w:rFonts w:ascii="Times New Roman" w:hAnsi="Times New Roman" w:cs="Times New Roman"/>
@@ -1723,7 +1400,6 @@
               </w:rPr>
               <w:t>Хаяг</w:t>
             </w:r>
-            <w:proofErr w:type="spellEnd"/>
           </w:p>
         </w:tc>
         <w:tc>
@@ -1740,7 +1416,6 @@
                 <w:szCs w:val="20"/>
               </w:rPr>
             </w:pPr>
-            <w:proofErr w:type="spellStart"/>
             <w:r>
               <w:rPr>
                 <w:rFonts w:ascii="Times New Roman" w:hAnsi="Times New Roman" w:cs="Times New Roman"/>
@@ -1749,7 +1424,6 @@
               </w:rPr>
               <w:t>Давхар</w:t>
             </w:r>
-            <w:proofErr w:type="spellEnd"/>
           </w:p>
         </w:tc>
         <w:tc>
@@ -1766,34 +1440,14 @@
                 <w:szCs w:val="20"/>
               </w:rPr>
             </w:pPr>
-            <w:proofErr w:type="spellStart"/>
             <w:r>
               <w:rPr>
                 <w:rFonts w:ascii="Times New Roman" w:hAnsi="Times New Roman" w:cs="Times New Roman"/>
                 <w:sz w:val="20"/>
                 <w:szCs w:val="20"/>
               </w:rPr>
-              <w:t>Өрөөний</w:t>
+              <w:t>Өрөөний тоо</w:t>
             </w:r>
-            <w:proofErr w:type="spellEnd"/>
-            <w:r>
-              <w:rPr>
-                <w:rFonts w:ascii="Times New Roman" w:hAnsi="Times New Roman" w:cs="Times New Roman"/>
-                <w:sz w:val="20"/>
-                <w:szCs w:val="20"/>
-              </w:rPr>
-              <w:t xml:space="preserve"> </w:t>
-            </w:r>
-            <w:proofErr w:type="spellStart"/>
-            <w:r>
-              <w:rPr>
-                <w:rFonts w:ascii="Times New Roman" w:hAnsi="Times New Roman" w:cs="Times New Roman"/>
-                <w:sz w:val="20"/>
-                <w:szCs w:val="20"/>
-              </w:rPr>
-              <w:t>тоо</w:t>
-            </w:r>
-            <w:proofErr w:type="spellEnd"/>
           </w:p>
         </w:tc>
         <w:tc>
@@ -1810,34 +1464,14 @@
                 <w:szCs w:val="20"/>
               </w:rPr>
             </w:pPr>
-            <w:proofErr w:type="spellStart"/>
             <w:r>
               <w:rPr>
                 <w:rFonts w:ascii="Times New Roman" w:hAnsi="Times New Roman" w:cs="Times New Roman"/>
                 <w:sz w:val="20"/>
                 <w:szCs w:val="20"/>
               </w:rPr>
-              <w:t>Талбайн</w:t>
+              <w:t>Талбайн хэмжээ</w:t>
             </w:r>
-            <w:proofErr w:type="spellEnd"/>
-            <w:r>
-              <w:rPr>
-                <w:rFonts w:ascii="Times New Roman" w:hAnsi="Times New Roman" w:cs="Times New Roman"/>
-                <w:sz w:val="20"/>
-                <w:szCs w:val="20"/>
-              </w:rPr>
-              <w:t xml:space="preserve"> </w:t>
-            </w:r>
-            <w:proofErr w:type="spellStart"/>
-            <w:r>
-              <w:rPr>
-                <w:rFonts w:ascii="Times New Roman" w:hAnsi="Times New Roman" w:cs="Times New Roman"/>
-                <w:sz w:val="20"/>
-                <w:szCs w:val="20"/>
-              </w:rPr>
-              <w:t>хэмжээ</w:t>
-            </w:r>
-            <w:proofErr w:type="spellEnd"/>
           </w:p>
         </w:tc>
       </w:tr>
@@ -1866,7 +1500,15 @@
                 <w:sz w:val="20"/>
                 <w:szCs w:val="20"/>
               </w:rPr>
-              <w:t>{{address}}</w:t>
+              <w:t>{{address</w:t>
+            </w:r>
+            <w:r>
+              <w:rPr>
+                <w:rFonts w:ascii="Times New Roman" w:hAnsi="Times New Roman" w:cs="Times New Roman"/>
+                <w:sz w:val="20"/>
+                <w:szCs w:val="20"/>
+              </w:rPr>
+              <w:t>}}</w:t>
             </w:r>
           </w:p>
         </w:tc>
@@ -1922,7 +1564,15 @@
                 <w:sz w:val="20"/>
                 <w:szCs w:val="20"/>
               </w:rPr>
-              <w:t>{{area}}</w:t>
+              <w:t>{{area</w:t>
+            </w:r>
+            <w:r>
+              <w:rPr>
+                <w:rFonts w:ascii="Times New Roman" w:hAnsi="Times New Roman" w:cs="Times New Roman"/>
+                <w:sz w:val="20"/>
+                <w:szCs w:val="20"/>
+              </w:rPr>
+              <w:t>}}</w:t>
             </w:r>
           </w:p>
         </w:tc>
@@ -1946,59 +1596,13 @@
                 <w:szCs w:val="20"/>
               </w:rPr>
             </w:pPr>
-            <w:proofErr w:type="spellStart"/>
             <w:r>
               <w:rPr>
                 <w:rFonts w:ascii="Times New Roman" w:hAnsi="Times New Roman" w:cs="Times New Roman"/>
                 <w:sz w:val="20"/>
                 <w:szCs w:val="20"/>
               </w:rPr>
-              <w:t>Энэхүү</w:t>
-            </w:r>
-            <w:proofErr w:type="spellEnd"/>
-            <w:r>
-              <w:rPr>
-                <w:rFonts w:ascii="Times New Roman" w:hAnsi="Times New Roman" w:cs="Times New Roman"/>
-                <w:sz w:val="20"/>
-                <w:szCs w:val="20"/>
-              </w:rPr>
-              <w:t xml:space="preserve"> </w:t>
-            </w:r>
-            <w:proofErr w:type="spellStart"/>
-            <w:r>
-              <w:rPr>
-                <w:rFonts w:ascii="Times New Roman" w:hAnsi="Times New Roman" w:cs="Times New Roman"/>
-                <w:sz w:val="20"/>
-                <w:szCs w:val="20"/>
-              </w:rPr>
-              <w:t>гэрээний</w:t>
-            </w:r>
-            <w:proofErr w:type="spellEnd"/>
-            <w:r>
-              <w:rPr>
-                <w:rFonts w:ascii="Times New Roman" w:hAnsi="Times New Roman" w:cs="Times New Roman"/>
-                <w:sz w:val="20"/>
-                <w:szCs w:val="20"/>
-              </w:rPr>
-              <w:t xml:space="preserve"> </w:t>
-            </w:r>
-            <w:proofErr w:type="spellStart"/>
-            <w:r>
-              <w:rPr>
-                <w:rFonts w:ascii="Times New Roman" w:hAnsi="Times New Roman" w:cs="Times New Roman"/>
-                <w:sz w:val="20"/>
-                <w:szCs w:val="20"/>
-              </w:rPr>
-              <w:t>хугацаа</w:t>
-            </w:r>
-            <w:proofErr w:type="spellEnd"/>
-            <w:r>
-              <w:rPr>
-                <w:rFonts w:ascii="Times New Roman" w:hAnsi="Times New Roman" w:cs="Times New Roman"/>
-                <w:sz w:val="20"/>
-                <w:szCs w:val="20"/>
-              </w:rPr>
-              <w:t xml:space="preserve"> (</w:t>
+              <w:t>Энэхүү гэрээний хугацаа (</w:t>
             </w:r>
             <w:r>
               <w:rPr>
@@ -2032,41 +1636,13 @@
                 <w:szCs w:val="20"/>
               </w:rPr>
             </w:pPr>
-            <w:proofErr w:type="spellStart"/>
             <w:r>
               <w:rPr>
                 <w:rFonts w:ascii="Times New Roman" w:hAnsi="Times New Roman" w:cs="Times New Roman"/>
                 <w:sz w:val="20"/>
                 <w:szCs w:val="20"/>
               </w:rPr>
-              <w:t>Өмчлөгчийн</w:t>
-            </w:r>
-            <w:proofErr w:type="spellEnd"/>
-            <w:r>
-              <w:rPr>
-                <w:rFonts w:ascii="Times New Roman" w:hAnsi="Times New Roman" w:cs="Times New Roman"/>
-                <w:sz w:val="20"/>
-                <w:szCs w:val="20"/>
-              </w:rPr>
-              <w:t xml:space="preserve"> </w:t>
-            </w:r>
-            <w:proofErr w:type="spellStart"/>
-            <w:r>
-              <w:rPr>
-                <w:rFonts w:ascii="Times New Roman" w:hAnsi="Times New Roman" w:cs="Times New Roman"/>
-                <w:sz w:val="20"/>
-                <w:szCs w:val="20"/>
-              </w:rPr>
-              <w:t>тоо</w:t>
-            </w:r>
-            <w:proofErr w:type="spellEnd"/>
-            <w:r>
-              <w:rPr>
-                <w:rFonts w:ascii="Times New Roman" w:hAnsi="Times New Roman" w:cs="Times New Roman"/>
-                <w:sz w:val="20"/>
-                <w:szCs w:val="20"/>
-              </w:rPr>
-              <w:t xml:space="preserve">: </w:t>
+              <w:t xml:space="preserve">Өмчлөгчийн тоо: </w:t>
             </w:r>
           </w:p>
         </w:tc>
@@ -2085,77 +1661,13 @@
                 <w:szCs w:val="20"/>
               </w:rPr>
             </w:pPr>
-            <w:proofErr w:type="spellStart"/>
             <w:r>
               <w:rPr>
                 <w:rFonts w:ascii="Times New Roman" w:hAnsi="Times New Roman" w:cs="Times New Roman"/>
                 <w:sz w:val="20"/>
                 <w:szCs w:val="20"/>
               </w:rPr>
-              <w:t>Төлөөлж</w:t>
-            </w:r>
-            <w:proofErr w:type="spellEnd"/>
-            <w:r>
-              <w:rPr>
-                <w:rFonts w:ascii="Times New Roman" w:hAnsi="Times New Roman" w:cs="Times New Roman"/>
-                <w:sz w:val="20"/>
-                <w:szCs w:val="20"/>
-              </w:rPr>
-              <w:t xml:space="preserve"> </w:t>
-            </w:r>
-            <w:proofErr w:type="spellStart"/>
-            <w:r>
-              <w:rPr>
-                <w:rFonts w:ascii="Times New Roman" w:hAnsi="Times New Roman" w:cs="Times New Roman"/>
-                <w:sz w:val="20"/>
-                <w:szCs w:val="20"/>
-              </w:rPr>
-              <w:t>гэрээ</w:t>
-            </w:r>
-            <w:proofErr w:type="spellEnd"/>
-            <w:r>
-              <w:rPr>
-                <w:rFonts w:ascii="Times New Roman" w:hAnsi="Times New Roman" w:cs="Times New Roman"/>
-                <w:sz w:val="20"/>
-                <w:szCs w:val="20"/>
-              </w:rPr>
-              <w:t xml:space="preserve"> </w:t>
-            </w:r>
-            <w:proofErr w:type="spellStart"/>
-            <w:r>
-              <w:rPr>
-                <w:rFonts w:ascii="Times New Roman" w:hAnsi="Times New Roman" w:cs="Times New Roman"/>
-                <w:sz w:val="20"/>
-                <w:szCs w:val="20"/>
-              </w:rPr>
-              <w:t>хийсэн</w:t>
-            </w:r>
-            <w:proofErr w:type="spellEnd"/>
-            <w:r>
-              <w:rPr>
-                <w:rFonts w:ascii="Times New Roman" w:hAnsi="Times New Roman" w:cs="Times New Roman"/>
-                <w:sz w:val="20"/>
-                <w:szCs w:val="20"/>
-              </w:rPr>
-              <w:t xml:space="preserve"> </w:t>
-            </w:r>
-            <w:proofErr w:type="spellStart"/>
-            <w:r>
-              <w:rPr>
-                <w:rFonts w:ascii="Times New Roman" w:hAnsi="Times New Roman" w:cs="Times New Roman"/>
-                <w:sz w:val="20"/>
-                <w:szCs w:val="20"/>
-              </w:rPr>
-              <w:t>өмчлөгч</w:t>
-            </w:r>
-            <w:proofErr w:type="spellEnd"/>
-            <w:r>
-              <w:rPr>
-                <w:rFonts w:ascii="Times New Roman" w:hAnsi="Times New Roman" w:cs="Times New Roman"/>
-                <w:sz w:val="20"/>
-                <w:szCs w:val="20"/>
-              </w:rPr>
-              <w:t xml:space="preserve">/ </w:t>
+              <w:t xml:space="preserve">Төлөөлж гэрээ хийсэн өмчлөгч/ </w:t>
             </w:r>
             <w:r>
               <w:rPr>
@@ -2195,34 +1707,14 @@
                 <w:szCs w:val="20"/>
               </w:rPr>
             </w:pPr>
-            <w:proofErr w:type="spellStart"/>
             <w:r>
               <w:rPr>
                 <w:rFonts w:ascii="Times New Roman" w:hAnsi="Times New Roman" w:cs="Times New Roman"/>
                 <w:sz w:val="20"/>
                 <w:szCs w:val="20"/>
               </w:rPr>
-              <w:t>Эхлэх</w:t>
+              <w:t>Эхлэх өдөр</w:t>
             </w:r>
-            <w:proofErr w:type="spellEnd"/>
-            <w:r>
-              <w:rPr>
-                <w:rFonts w:ascii="Times New Roman" w:hAnsi="Times New Roman" w:cs="Times New Roman"/>
-                <w:sz w:val="20"/>
-                <w:szCs w:val="20"/>
-              </w:rPr>
-              <w:t xml:space="preserve"> </w:t>
-            </w:r>
-            <w:proofErr w:type="spellStart"/>
-            <w:r>
-              <w:rPr>
-                <w:rFonts w:ascii="Times New Roman" w:hAnsi="Times New Roman" w:cs="Times New Roman"/>
-                <w:sz w:val="20"/>
-                <w:szCs w:val="20"/>
-              </w:rPr>
-              <w:t>өдөр</w:t>
-            </w:r>
-            <w:proofErr w:type="spellEnd"/>
           </w:p>
         </w:tc>
         <w:tc>
@@ -2239,52 +1731,14 @@
                 <w:szCs w:val="20"/>
               </w:rPr>
             </w:pPr>
-            <w:proofErr w:type="spellStart"/>
             <w:r>
               <w:rPr>
                 <w:rFonts w:ascii="Times New Roman" w:hAnsi="Times New Roman" w:cs="Times New Roman"/>
                 <w:sz w:val="20"/>
                 <w:szCs w:val="20"/>
               </w:rPr>
-              <w:t>Дуусгавар</w:t>
+              <w:t>Дуусгавар болох өдөр</w:t>
             </w:r>
-            <w:proofErr w:type="spellEnd"/>
-            <w:r>
-              <w:rPr>
-                <w:rFonts w:ascii="Times New Roman" w:hAnsi="Times New Roman" w:cs="Times New Roman"/>
-                <w:sz w:val="20"/>
-                <w:szCs w:val="20"/>
-              </w:rPr>
-              <w:t xml:space="preserve"> </w:t>
-            </w:r>
-            <w:proofErr w:type="spellStart"/>
-            <w:r>
-              <w:rPr>
-                <w:rFonts w:ascii="Times New Roman" w:hAnsi="Times New Roman" w:cs="Times New Roman"/>
-                <w:sz w:val="20"/>
-                <w:szCs w:val="20"/>
-              </w:rPr>
-              <w:t>болох</w:t>
-            </w:r>
-            <w:proofErr w:type="spellEnd"/>
-            <w:r>
-              <w:rPr>
-                <w:rFonts w:ascii="Times New Roman" w:hAnsi="Times New Roman" w:cs="Times New Roman"/>
-                <w:sz w:val="20"/>
-                <w:szCs w:val="20"/>
-              </w:rPr>
-              <w:t xml:space="preserve"> </w:t>
-            </w:r>
-            <w:proofErr w:type="spellStart"/>
-            <w:r>
-              <w:rPr>
-                <w:rFonts w:ascii="Times New Roman" w:hAnsi="Times New Roman" w:cs="Times New Roman"/>
-                <w:sz w:val="20"/>
-                <w:szCs w:val="20"/>
-              </w:rPr>
-              <w:t>өдөр</w:t>
-            </w:r>
-            <w:proofErr w:type="spellEnd"/>
           </w:p>
         </w:tc>
         <w:tc>
@@ -2301,7 +1755,6 @@
                 <w:szCs w:val="20"/>
               </w:rPr>
             </w:pPr>
-            <w:proofErr w:type="spellStart"/>
             <w:r>
               <w:rPr>
                 <w:rFonts w:ascii="Times New Roman" w:hAnsi="Times New Roman" w:cs="Times New Roman"/>
@@ -2310,7 +1763,6 @@
               </w:rPr>
               <w:t>Сараар</w:t>
             </w:r>
-            <w:proofErr w:type="spellEnd"/>
           </w:p>
         </w:tc>
         <w:tc>
@@ -2377,7 +1829,15 @@
                 <w:sz w:val="20"/>
                 <w:szCs w:val="20"/>
               </w:rPr>
-              <w:t>{{price}}</w:t>
+              <w:t>{{price</w:t>
+            </w:r>
+            <w:r>
+              <w:rPr>
+                <w:rFonts w:ascii="Times New Roman" w:hAnsi="Times New Roman" w:cs="Times New Roman"/>
+                <w:sz w:val="20"/>
+                <w:szCs w:val="20"/>
+              </w:rPr>
+              <w:t>}}</w:t>
             </w:r>
           </w:p>
         </w:tc>
@@ -2456,34 +1916,14 @@
                 <w:szCs w:val="20"/>
               </w:rPr>
             </w:pPr>
-            <w:proofErr w:type="spellStart"/>
             <w:r>
               <w:rPr>
                 <w:rFonts w:ascii="Times New Roman" w:hAnsi="Times New Roman" w:cs="Times New Roman"/>
                 <w:sz w:val="20"/>
                 <w:szCs w:val="20"/>
               </w:rPr>
-              <w:t>Хуулийн</w:t>
+              <w:t>Хуулийн этгээд</w:t>
             </w:r>
-            <w:proofErr w:type="spellEnd"/>
-            <w:r>
-              <w:rPr>
-                <w:rFonts w:ascii="Times New Roman" w:hAnsi="Times New Roman" w:cs="Times New Roman"/>
-                <w:sz w:val="20"/>
-                <w:szCs w:val="20"/>
-              </w:rPr>
-              <w:t xml:space="preserve"> </w:t>
-            </w:r>
-            <w:proofErr w:type="spellStart"/>
-            <w:r>
-              <w:rPr>
-                <w:rFonts w:ascii="Times New Roman" w:hAnsi="Times New Roman" w:cs="Times New Roman"/>
-                <w:sz w:val="20"/>
-                <w:szCs w:val="20"/>
-              </w:rPr>
-              <w:t>этгээд</w:t>
-            </w:r>
-            <w:proofErr w:type="spellEnd"/>
           </w:p>
           <w:p>
             <w:pPr>
@@ -2541,18 +1981,8 @@
                 <w:sz w:val="20"/>
                 <w:szCs w:val="20"/>
               </w:rPr>
-              <w:t>{{</w:t>
+              <w:t>{{startDate</w:t>
             </w:r>
-            <w:proofErr w:type="spellStart"/>
-            <w:r>
-              <w:rPr>
-                <w:rFonts w:ascii="Times New Roman" w:hAnsi="Times New Roman" w:cs="Times New Roman"/>
-                <w:sz w:val="20"/>
-                <w:szCs w:val="20"/>
-              </w:rPr>
-              <w:t>startDate</w:t>
-            </w:r>
-            <w:proofErr w:type="spellEnd"/>
             <w:r>
               <w:rPr>
                 <w:rFonts w:ascii="Times New Roman" w:hAnsi="Times New Roman" w:cs="Times New Roman"/>
@@ -2583,18 +2013,8 @@
                 <w:sz w:val="20"/>
                 <w:szCs w:val="20"/>
               </w:rPr>
-              <w:t>{{</w:t>
+              <w:t>{{endDate</w:t>
             </w:r>
-            <w:proofErr w:type="spellStart"/>
-            <w:r>
-              <w:rPr>
-                <w:rFonts w:ascii="Times New Roman" w:hAnsi="Times New Roman" w:cs="Times New Roman"/>
-                <w:sz w:val="20"/>
-                <w:szCs w:val="20"/>
-              </w:rPr>
-              <w:t>endDate</w:t>
-            </w:r>
-            <w:proofErr w:type="spellEnd"/>
             <w:r>
               <w:rPr>
                 <w:rFonts w:ascii="Times New Roman" w:hAnsi="Times New Roman" w:cs="Times New Roman"/>
@@ -2625,7 +2045,15 @@
                 <w:sz w:val="20"/>
                 <w:szCs w:val="20"/>
               </w:rPr>
-              <w:t>{{duration}}</w:t>
+              <w:t>{{duration</w:t>
+            </w:r>
+            <w:r>
+              <w:rPr>
+                <w:rFonts w:ascii="Times New Roman" w:hAnsi="Times New Roman" w:cs="Times New Roman"/>
+                <w:sz w:val="20"/>
+                <w:szCs w:val="20"/>
+              </w:rPr>
+              <w:t>}}</w:t>
             </w:r>
           </w:p>
         </w:tc>
@@ -2756,59 +2184,13 @@
                 <w:szCs w:val="20"/>
               </w:rPr>
             </w:pPr>
-            <w:proofErr w:type="spellStart"/>
             <w:r>
               <w:rPr>
                 <w:rFonts w:ascii="Times New Roman" w:hAnsi="Times New Roman" w:cs="Times New Roman"/>
                 <w:sz w:val="20"/>
                 <w:szCs w:val="20"/>
               </w:rPr>
-              <w:t>Нотолсон</w:t>
-            </w:r>
-            <w:proofErr w:type="spellEnd"/>
-            <w:r>
-              <w:rPr>
-                <w:rFonts w:ascii="Times New Roman" w:hAnsi="Times New Roman" w:cs="Times New Roman"/>
-                <w:sz w:val="20"/>
-                <w:szCs w:val="20"/>
-              </w:rPr>
-              <w:t xml:space="preserve"> </w:t>
-            </w:r>
-            <w:proofErr w:type="spellStart"/>
-            <w:r>
-              <w:rPr>
-                <w:rFonts w:ascii="Times New Roman" w:hAnsi="Times New Roman" w:cs="Times New Roman"/>
-                <w:sz w:val="20"/>
-                <w:szCs w:val="20"/>
-              </w:rPr>
-              <w:t>гарын</w:t>
-            </w:r>
-            <w:proofErr w:type="spellEnd"/>
-            <w:r>
-              <w:rPr>
-                <w:rFonts w:ascii="Times New Roman" w:hAnsi="Times New Roman" w:cs="Times New Roman"/>
-                <w:sz w:val="20"/>
-                <w:szCs w:val="20"/>
-              </w:rPr>
-              <w:t xml:space="preserve"> </w:t>
-            </w:r>
-            <w:proofErr w:type="spellStart"/>
-            <w:r>
-              <w:rPr>
-                <w:rFonts w:ascii="Times New Roman" w:hAnsi="Times New Roman" w:cs="Times New Roman"/>
-                <w:sz w:val="20"/>
-                <w:szCs w:val="20"/>
-              </w:rPr>
-              <w:t>үсэг</w:t>
-            </w:r>
-            <w:proofErr w:type="spellEnd"/>
-            <w:r>
-              <w:rPr>
-                <w:rFonts w:ascii="Times New Roman" w:hAnsi="Times New Roman" w:cs="Times New Roman"/>
-                <w:sz w:val="20"/>
-                <w:szCs w:val="20"/>
-              </w:rPr>
-              <w:t>:</w:t>
+              <w:t>Нотолсон гарын үсэг:</w:t>
             </w:r>
           </w:p>
           <w:p>
@@ -2875,59 +2257,13 @@
                 <w:szCs w:val="20"/>
               </w:rPr>
             </w:pPr>
-            <w:proofErr w:type="spellStart"/>
             <w:r>
               <w:rPr>
                 <w:rFonts w:ascii="Times New Roman" w:hAnsi="Times New Roman" w:cs="Times New Roman"/>
                 <w:sz w:val="20"/>
                 <w:szCs w:val="20"/>
               </w:rPr>
-              <w:t>Нотолсон</w:t>
-            </w:r>
-            <w:proofErr w:type="spellEnd"/>
-            <w:r>
-              <w:rPr>
-                <w:rFonts w:ascii="Times New Roman" w:hAnsi="Times New Roman" w:cs="Times New Roman"/>
-                <w:sz w:val="20"/>
-                <w:szCs w:val="20"/>
-              </w:rPr>
-              <w:t xml:space="preserve"> </w:t>
-            </w:r>
-            <w:proofErr w:type="spellStart"/>
-            <w:r>
-              <w:rPr>
-                <w:rFonts w:ascii="Times New Roman" w:hAnsi="Times New Roman" w:cs="Times New Roman"/>
-                <w:sz w:val="20"/>
-                <w:szCs w:val="20"/>
-              </w:rPr>
-              <w:t>гарын</w:t>
-            </w:r>
-            <w:proofErr w:type="spellEnd"/>
-            <w:r>
-              <w:rPr>
-                <w:rFonts w:ascii="Times New Roman" w:hAnsi="Times New Roman" w:cs="Times New Roman"/>
-                <w:sz w:val="20"/>
-                <w:szCs w:val="20"/>
-              </w:rPr>
-              <w:t xml:space="preserve"> </w:t>
-            </w:r>
-            <w:proofErr w:type="spellStart"/>
-            <w:r>
-              <w:rPr>
-                <w:rFonts w:ascii="Times New Roman" w:hAnsi="Times New Roman" w:cs="Times New Roman"/>
-                <w:sz w:val="20"/>
-                <w:szCs w:val="20"/>
-              </w:rPr>
-              <w:t>үсэг</w:t>
-            </w:r>
-            <w:proofErr w:type="spellEnd"/>
-            <w:r>
-              <w:rPr>
-                <w:rFonts w:ascii="Times New Roman" w:hAnsi="Times New Roman" w:cs="Times New Roman"/>
-                <w:sz w:val="20"/>
-                <w:szCs w:val="20"/>
-              </w:rPr>
-              <w:t>:</w:t>
+              <w:t>Нотолсон гарын үсэг:</w:t>
             </w:r>
           </w:p>
           <w:p>
@@ -2994,59 +2330,13 @@
                 <w:szCs w:val="20"/>
               </w:rPr>
             </w:pPr>
-            <w:proofErr w:type="spellStart"/>
             <w:r>
               <w:rPr>
                 <w:rFonts w:ascii="Times New Roman" w:hAnsi="Times New Roman" w:cs="Times New Roman"/>
                 <w:sz w:val="20"/>
                 <w:szCs w:val="20"/>
               </w:rPr>
-              <w:t>Нотолсон</w:t>
-            </w:r>
-            <w:proofErr w:type="spellEnd"/>
-            <w:r>
-              <w:rPr>
-                <w:rFonts w:ascii="Times New Roman" w:hAnsi="Times New Roman" w:cs="Times New Roman"/>
-                <w:sz w:val="20"/>
-                <w:szCs w:val="20"/>
-              </w:rPr>
-              <w:t xml:space="preserve"> </w:t>
-            </w:r>
-            <w:proofErr w:type="spellStart"/>
-            <w:r>
-              <w:rPr>
-                <w:rFonts w:ascii="Times New Roman" w:hAnsi="Times New Roman" w:cs="Times New Roman"/>
-                <w:sz w:val="20"/>
-                <w:szCs w:val="20"/>
-              </w:rPr>
-              <w:t>гарын</w:t>
-            </w:r>
-            <w:proofErr w:type="spellEnd"/>
-            <w:r>
-              <w:rPr>
-                <w:rFonts w:ascii="Times New Roman" w:hAnsi="Times New Roman" w:cs="Times New Roman"/>
-                <w:sz w:val="20"/>
-                <w:szCs w:val="20"/>
-              </w:rPr>
-              <w:t xml:space="preserve"> </w:t>
-            </w:r>
-            <w:proofErr w:type="spellStart"/>
-            <w:r>
-              <w:rPr>
-                <w:rFonts w:ascii="Times New Roman" w:hAnsi="Times New Roman" w:cs="Times New Roman"/>
-                <w:sz w:val="20"/>
-                <w:szCs w:val="20"/>
-              </w:rPr>
-              <w:t>үсэг</w:t>
-            </w:r>
-            <w:proofErr w:type="spellEnd"/>
-            <w:r>
-              <w:rPr>
-                <w:rFonts w:ascii="Times New Roman" w:hAnsi="Times New Roman" w:cs="Times New Roman"/>
-                <w:sz w:val="20"/>
-                <w:szCs w:val="20"/>
-              </w:rPr>
-              <w:t>:</w:t>
+              <w:t>Нотолсон гарын үсэг:</w:t>
             </w:r>
           </w:p>
           <w:p>
@@ -3088,142 +2378,14 @@
                 <w:szCs w:val="20"/>
               </w:rPr>
             </w:pPr>
-            <w:proofErr w:type="spellStart"/>
             <w:r>
               <w:rPr>
                 <w:rFonts w:ascii="Times New Roman" w:hAnsi="Times New Roman" w:cs="Times New Roman"/>
                 <w:sz w:val="20"/>
                 <w:szCs w:val="20"/>
               </w:rPr>
-              <w:t>Мэдээллийг</w:t>
+              <w:t>Мэдээллийг цааш төрийн захиргааны байгууллагын хэрэгцээнд илгээхийг зөвшөөрөх</w:t>
             </w:r>
-            <w:proofErr w:type="spellEnd"/>
-            <w:r>
-              <w:rPr>
-                <w:rFonts w:ascii="Times New Roman" w:hAnsi="Times New Roman" w:cs="Times New Roman"/>
-                <w:sz w:val="20"/>
-                <w:szCs w:val="20"/>
-              </w:rPr>
-              <w:t xml:space="preserve"> </w:t>
-            </w:r>
-            <w:proofErr w:type="spellStart"/>
-            <w:r>
-              <w:rPr>
-                <w:rFonts w:ascii="Times New Roman" w:hAnsi="Times New Roman" w:cs="Times New Roman"/>
-                <w:sz w:val="20"/>
-                <w:szCs w:val="20"/>
-              </w:rPr>
-              <w:t>цааш</w:t>
-            </w:r>
-            <w:proofErr w:type="spellEnd"/>
-            <w:r>
-              <w:rPr>
-                <w:rFonts w:ascii="Times New Roman" w:hAnsi="Times New Roman" w:cs="Times New Roman"/>
-                <w:sz w:val="20"/>
-                <w:szCs w:val="20"/>
-              </w:rPr>
-              <w:t xml:space="preserve"> </w:t>
-            </w:r>
-            <w:proofErr w:type="spellStart"/>
-            <w:r>
-              <w:rPr>
-                <w:rFonts w:ascii="Times New Roman" w:hAnsi="Times New Roman" w:cs="Times New Roman"/>
-                <w:sz w:val="20"/>
-                <w:szCs w:val="20"/>
-              </w:rPr>
-              <w:t>төрийн</w:t>
-            </w:r>
-            <w:proofErr w:type="spellEnd"/>
-            <w:r>
-              <w:rPr>
-                <w:rFonts w:ascii="Times New Roman" w:hAnsi="Times New Roman" w:cs="Times New Roman"/>
-                <w:sz w:val="20"/>
-                <w:szCs w:val="20"/>
-              </w:rPr>
-              <w:t xml:space="preserve"> </w:t>
-            </w:r>
-            <w:proofErr w:type="spellStart"/>
-            <w:r>
-              <w:rPr>
-                <w:rFonts w:ascii="Times New Roman" w:hAnsi="Times New Roman" w:cs="Times New Roman"/>
-                <w:sz w:val="20"/>
-                <w:szCs w:val="20"/>
-              </w:rPr>
-              <w:t>захиргааны</w:t>
-            </w:r>
-            <w:proofErr w:type="spellEnd"/>
-            <w:r>
-              <w:rPr>
-                <w:rFonts w:ascii="Times New Roman" w:hAnsi="Times New Roman" w:cs="Times New Roman"/>
-                <w:sz w:val="20"/>
-                <w:szCs w:val="20"/>
-              </w:rPr>
-              <w:t xml:space="preserve"> </w:t>
-            </w:r>
-            <w:proofErr w:type="spellStart"/>
-            <w:r>
-              <w:rPr>
-                <w:rFonts w:ascii="Times New Roman" w:hAnsi="Times New Roman" w:cs="Times New Roman"/>
-                <w:sz w:val="20"/>
-                <w:szCs w:val="20"/>
-              </w:rPr>
-              <w:t>байгууллагын</w:t>
-            </w:r>
-            <w:proofErr w:type="spellEnd"/>
-            <w:r>
-              <w:rPr>
-                <w:rFonts w:ascii="Times New Roman" w:hAnsi="Times New Roman" w:cs="Times New Roman"/>
-                <w:sz w:val="20"/>
-                <w:szCs w:val="20"/>
-              </w:rPr>
-              <w:t xml:space="preserve"> </w:t>
-            </w:r>
-            <w:proofErr w:type="spellStart"/>
-            <w:r>
-              <w:rPr>
-                <w:rFonts w:ascii="Times New Roman" w:hAnsi="Times New Roman" w:cs="Times New Roman"/>
-                <w:sz w:val="20"/>
-                <w:szCs w:val="20"/>
-              </w:rPr>
-              <w:t>хэрэгцээнд</w:t>
-            </w:r>
-            <w:proofErr w:type="spellEnd"/>
-            <w:r>
-              <w:rPr>
-                <w:rFonts w:ascii="Times New Roman" w:hAnsi="Times New Roman" w:cs="Times New Roman"/>
-                <w:sz w:val="20"/>
-                <w:szCs w:val="20"/>
-              </w:rPr>
-              <w:t xml:space="preserve"> </w:t>
-            </w:r>
-            <w:proofErr w:type="spellStart"/>
-            <w:r>
-              <w:rPr>
-                <w:rFonts w:ascii="Times New Roman" w:hAnsi="Times New Roman" w:cs="Times New Roman"/>
-                <w:sz w:val="20"/>
-                <w:szCs w:val="20"/>
-              </w:rPr>
-              <w:t>илгээхийг</w:t>
-            </w:r>
-            <w:proofErr w:type="spellEnd"/>
-            <w:r>
-              <w:rPr>
-                <w:rFonts w:ascii="Times New Roman" w:hAnsi="Times New Roman" w:cs="Times New Roman"/>
-                <w:sz w:val="20"/>
-                <w:szCs w:val="20"/>
-              </w:rPr>
-              <w:t xml:space="preserve"> </w:t>
-            </w:r>
-            <w:proofErr w:type="spellStart"/>
-            <w:r>
-              <w:rPr>
-                <w:rFonts w:ascii="Times New Roman" w:hAnsi="Times New Roman" w:cs="Times New Roman"/>
-                <w:sz w:val="20"/>
-                <w:szCs w:val="20"/>
-              </w:rPr>
-              <w:t>зөвшөөрөх</w:t>
-            </w:r>
-            <w:proofErr w:type="spellEnd"/>
           </w:p>
         </w:tc>
         <w:tc>
@@ -3240,59 +2402,13 @@
                 <w:szCs w:val="20"/>
               </w:rPr>
             </w:pPr>
-            <w:proofErr w:type="spellStart"/>
             <w:r>
               <w:rPr>
                 <w:rFonts w:ascii="Times New Roman" w:hAnsi="Times New Roman" w:cs="Times New Roman"/>
                 <w:sz w:val="20"/>
                 <w:szCs w:val="20"/>
               </w:rPr>
-              <w:t>Нотолсон</w:t>
-            </w:r>
-            <w:proofErr w:type="spellEnd"/>
-            <w:r>
-              <w:rPr>
-                <w:rFonts w:ascii="Times New Roman" w:hAnsi="Times New Roman" w:cs="Times New Roman"/>
-                <w:sz w:val="20"/>
-                <w:szCs w:val="20"/>
-              </w:rPr>
-              <w:t xml:space="preserve"> </w:t>
-            </w:r>
-            <w:proofErr w:type="spellStart"/>
-            <w:r>
-              <w:rPr>
-                <w:rFonts w:ascii="Times New Roman" w:hAnsi="Times New Roman" w:cs="Times New Roman"/>
-                <w:sz w:val="20"/>
-                <w:szCs w:val="20"/>
-              </w:rPr>
-              <w:t>гарын</w:t>
-            </w:r>
-            <w:proofErr w:type="spellEnd"/>
-            <w:r>
-              <w:rPr>
-                <w:rFonts w:ascii="Times New Roman" w:hAnsi="Times New Roman" w:cs="Times New Roman"/>
-                <w:sz w:val="20"/>
-                <w:szCs w:val="20"/>
-              </w:rPr>
-              <w:t xml:space="preserve"> </w:t>
-            </w:r>
-            <w:proofErr w:type="spellStart"/>
-            <w:r>
-              <w:rPr>
-                <w:rFonts w:ascii="Times New Roman" w:hAnsi="Times New Roman" w:cs="Times New Roman"/>
-                <w:sz w:val="20"/>
-                <w:szCs w:val="20"/>
-              </w:rPr>
-              <w:t>үсэг</w:t>
-            </w:r>
-            <w:proofErr w:type="spellEnd"/>
-            <w:r>
-              <w:rPr>
-                <w:rFonts w:ascii="Times New Roman" w:hAnsi="Times New Roman" w:cs="Times New Roman"/>
-                <w:sz w:val="20"/>
-                <w:szCs w:val="20"/>
-              </w:rPr>
-              <w:t>:</w:t>
+              <w:t>Нотолсон гарын үсэг:</w:t>
             </w:r>
           </w:p>
           <w:p>
@@ -3335,41 +2451,13 @@
                 <w:lang w:val="mn-MN"/>
               </w:rPr>
             </w:pPr>
-            <w:proofErr w:type="spellStart"/>
             <w:r>
               <w:rPr>
                 <w:rFonts w:ascii="Times New Roman" w:hAnsi="Times New Roman" w:cs="Times New Roman"/>
                 <w:sz w:val="20"/>
                 <w:szCs w:val="20"/>
               </w:rPr>
-              <w:t>Энэхүү</w:t>
-            </w:r>
-            <w:proofErr w:type="spellEnd"/>
-            <w:r>
-              <w:rPr>
-                <w:rFonts w:ascii="Times New Roman" w:hAnsi="Times New Roman" w:cs="Times New Roman"/>
-                <w:sz w:val="20"/>
-                <w:szCs w:val="20"/>
-              </w:rPr>
-              <w:t xml:space="preserve"> </w:t>
-            </w:r>
-            <w:proofErr w:type="spellStart"/>
-            <w:r>
-              <w:rPr>
-                <w:rFonts w:ascii="Times New Roman" w:hAnsi="Times New Roman" w:cs="Times New Roman"/>
-                <w:sz w:val="20"/>
-                <w:szCs w:val="20"/>
-              </w:rPr>
-              <w:t>гэрээний</w:t>
-            </w:r>
-            <w:proofErr w:type="spellEnd"/>
-            <w:r>
-              <w:rPr>
-                <w:rFonts w:ascii="Times New Roman" w:hAnsi="Times New Roman" w:cs="Times New Roman"/>
-                <w:sz w:val="20"/>
-                <w:szCs w:val="20"/>
-              </w:rPr>
-              <w:t xml:space="preserve"> 4.1-</w:t>
+              <w:t>Энэхүү гэрээний 4.1-</w:t>
             </w:r>
             <w:r>
               <w:rPr>
@@ -3403,18 +2491,8 @@
                 <w:sz w:val="20"/>
                 <w:szCs w:val="20"/>
               </w:rPr>
-              <w:t>{{</w:t>
+              <w:t>{{commissionRate</w:t>
             </w:r>
-            <w:proofErr w:type="spellStart"/>
-            <w:r>
-              <w:rPr>
-                <w:rFonts w:ascii="Times New Roman" w:hAnsi="Times New Roman" w:cs="Times New Roman"/>
-                <w:sz w:val="20"/>
-                <w:szCs w:val="20"/>
-              </w:rPr>
-              <w:t>commissionRate</w:t>
-            </w:r>
-            <w:proofErr w:type="spellEnd"/>
             <w:r>
               <w:rPr>
                 <w:rFonts w:ascii="Times New Roman" w:hAnsi="Times New Roman" w:cs="Times New Roman"/>
@@ -3445,41 +2523,13 @@
                 <w:szCs w:val="20"/>
               </w:rPr>
             </w:pPr>
-            <w:proofErr w:type="spellStart"/>
             <w:r>
               <w:rPr>
                 <w:rFonts w:ascii="Times New Roman" w:hAnsi="Times New Roman" w:cs="Times New Roman"/>
                 <w:sz w:val="20"/>
                 <w:szCs w:val="20"/>
               </w:rPr>
-              <w:t>Энэхүү</w:t>
-            </w:r>
-            <w:proofErr w:type="spellEnd"/>
-            <w:r>
-              <w:rPr>
-                <w:rFonts w:ascii="Times New Roman" w:hAnsi="Times New Roman" w:cs="Times New Roman"/>
-                <w:sz w:val="20"/>
-                <w:szCs w:val="20"/>
-              </w:rPr>
-              <w:t xml:space="preserve"> </w:t>
-            </w:r>
-            <w:proofErr w:type="spellStart"/>
-            <w:r>
-              <w:rPr>
-                <w:rFonts w:ascii="Times New Roman" w:hAnsi="Times New Roman" w:cs="Times New Roman"/>
-                <w:sz w:val="20"/>
-                <w:szCs w:val="20"/>
-              </w:rPr>
-              <w:t>гэрээний</w:t>
-            </w:r>
-            <w:proofErr w:type="spellEnd"/>
-            <w:r>
-              <w:rPr>
-                <w:rFonts w:ascii="Times New Roman" w:hAnsi="Times New Roman" w:cs="Times New Roman"/>
-                <w:sz w:val="20"/>
-                <w:szCs w:val="20"/>
-              </w:rPr>
-              <w:t xml:space="preserve"> 4.1-</w:t>
+              <w:t>Энэхүү гэрээний 4.1-</w:t>
             </w:r>
             <w:r>
               <w:rPr>
@@ -3513,18 +2563,8 @@
                 <w:sz w:val="20"/>
                 <w:szCs w:val="20"/>
               </w:rPr>
-              <w:t>{{</w:t>
+              <w:t>{{commissionAmount</w:t>
             </w:r>
-            <w:proofErr w:type="spellStart"/>
-            <w:r>
-              <w:rPr>
-                <w:rFonts w:ascii="Times New Roman" w:hAnsi="Times New Roman" w:cs="Times New Roman"/>
-                <w:sz w:val="20"/>
-                <w:szCs w:val="20"/>
-              </w:rPr>
-              <w:t>commissionAmount</w:t>
-            </w:r>
-            <w:proofErr w:type="spellEnd"/>
             <w:r>
               <w:rPr>
                 <w:rFonts w:ascii="Times New Roman" w:hAnsi="Times New Roman" w:cs="Times New Roman"/>
@@ -3555,69 +2595,13 @@
                 <w:szCs w:val="20"/>
               </w:rPr>
             </w:pPr>
-            <w:proofErr w:type="spellStart"/>
             <w:r>
               <w:rPr>
                 <w:rFonts w:ascii="Times New Roman" w:hAnsi="Times New Roman" w:cs="Times New Roman"/>
                 <w:sz w:val="20"/>
                 <w:szCs w:val="20"/>
               </w:rPr>
-              <w:t>Зуучлалын</w:t>
-            </w:r>
-            <w:proofErr w:type="spellEnd"/>
-            <w:r>
-              <w:rPr>
-                <w:rFonts w:ascii="Times New Roman" w:hAnsi="Times New Roman" w:cs="Times New Roman"/>
-                <w:sz w:val="20"/>
-                <w:szCs w:val="20"/>
-              </w:rPr>
-              <w:t xml:space="preserve"> </w:t>
-            </w:r>
-            <w:proofErr w:type="spellStart"/>
-            <w:r>
-              <w:rPr>
-                <w:rFonts w:ascii="Times New Roman" w:hAnsi="Times New Roman" w:cs="Times New Roman"/>
-                <w:sz w:val="20"/>
-                <w:szCs w:val="20"/>
-              </w:rPr>
-              <w:t>хөлс</w:t>
-            </w:r>
-            <w:proofErr w:type="spellEnd"/>
-            <w:r>
-              <w:rPr>
-                <w:rFonts w:ascii="Times New Roman" w:hAnsi="Times New Roman" w:cs="Times New Roman"/>
-                <w:sz w:val="20"/>
-                <w:szCs w:val="20"/>
-              </w:rPr>
-              <w:t xml:space="preserve"> </w:t>
-            </w:r>
-            <w:proofErr w:type="spellStart"/>
-            <w:proofErr w:type="gramStart"/>
-            <w:r>
-              <w:rPr>
-                <w:rFonts w:ascii="Times New Roman" w:hAnsi="Times New Roman" w:cs="Times New Roman"/>
-                <w:sz w:val="20"/>
-                <w:szCs w:val="20"/>
-              </w:rPr>
-              <w:t>үсгээр</w:t>
-            </w:r>
-            <w:proofErr w:type="spellEnd"/>
-            <w:r>
-              <w:rPr>
-                <w:rFonts w:ascii="Times New Roman" w:hAnsi="Times New Roman" w:cs="Times New Roman"/>
-                <w:sz w:val="20"/>
-                <w:szCs w:val="20"/>
-              </w:rPr>
-              <w:t>:…</w:t>
-            </w:r>
-            <w:proofErr w:type="gramEnd"/>
-            <w:r>
-              <w:rPr>
-                <w:rFonts w:ascii="Times New Roman" w:hAnsi="Times New Roman" w:cs="Times New Roman"/>
-                <w:sz w:val="20"/>
-                <w:szCs w:val="20"/>
-              </w:rPr>
-              <w:t>……………………………………………………………………………………………..</w:t>
+              <w:t>Зуучлалын хөлс үсгээр:………………………………………………………………………………………………..</w:t>
             </w:r>
           </w:p>
         </w:tc>
@@ -3674,7 +2658,6 @@
           <w:bCs/>
           <w:lang w:val="mn-MN"/>
         </w:rPr>
-        <w:lastRenderedPageBreak/>
         <w:t>НЭГ. ЕРӨНХИЙ НӨХЦӨЛ</w:t>
       </w:r>
     </w:p>
@@ -3899,7 +2882,7 @@
           <w:b/>
           <w:lang w:val="mn-MN"/>
         </w:rPr>
-        <w:t xml:space="preserve">{{duration}} </w:t>
+        <w:t>{{duration</w:t>
       </w:r>
       <w:r>
         <w:rPr>
@@ -3907,6 +2890,22 @@
           <w:b/>
           <w:lang w:val="mn-MN"/>
         </w:rPr>
+        <w:t>}}</w:t>
+      </w:r>
+      <w:r>
+        <w:rPr>
+          <w:rFonts w:ascii="Times New Roman" w:hAnsi="Times New Roman" w:cs="Times New Roman"/>
+          <w:b/>
+          <w:lang w:val="mn-MN"/>
+        </w:rPr>
+        <w:t xml:space="preserve"> </w:t>
+      </w:r>
+      <w:r>
+        <w:rPr>
+          <w:rFonts w:ascii="Times New Roman" w:hAnsi="Times New Roman" w:cs="Times New Roman"/>
+          <w:b/>
+          <w:lang w:val="mn-MN"/>
+        </w:rPr>
         <w:t xml:space="preserve">сарын хугацаатай байх бөгөөд </w:t>
       </w:r>
       <w:r>
@@ -3915,7 +2914,7 @@
           <w:b/>
           <w:lang w:val="mn-MN"/>
         </w:rPr>
-        <w:t xml:space="preserve">{{startDate}} </w:t>
+        <w:t>{{startDate</w:t>
       </w:r>
       <w:r>
         <w:rPr>
@@ -3923,6 +2922,22 @@
           <w:b/>
           <w:lang w:val="mn-MN"/>
         </w:rPr>
+        <w:t>}}</w:t>
+      </w:r>
+      <w:r>
+        <w:rPr>
+          <w:rFonts w:ascii="Times New Roman" w:hAnsi="Times New Roman" w:cs="Times New Roman"/>
+          <w:b/>
+          <w:lang w:val="mn-MN"/>
+        </w:rPr>
+        <w:t xml:space="preserve"> </w:t>
+      </w:r>
+      <w:r>
+        <w:rPr>
+          <w:rFonts w:ascii="Times New Roman" w:hAnsi="Times New Roman" w:cs="Times New Roman"/>
+          <w:b/>
+          <w:lang w:val="mn-MN"/>
+        </w:rPr>
         <w:t>-</w:t>
       </w:r>
       <w:r>
@@ -3939,7 +2954,23 @@
           <w:b/>
           <w:lang w:val="mn-MN"/>
         </w:rPr>
-        <w:t xml:space="preserve">{{endDate}} </w:t>
+        <w:t>{{endDate</w:t>
+      </w:r>
+      <w:r>
+        <w:rPr>
+          <w:rFonts w:ascii="Times New Roman" w:hAnsi="Times New Roman" w:cs="Times New Roman"/>
+          <w:b/>
+          <w:lang w:val="mn-MN"/>
+        </w:rPr>
+        <w:t>}}</w:t>
+      </w:r>
+      <w:r>
+        <w:rPr>
+          <w:rFonts w:ascii="Times New Roman" w:hAnsi="Times New Roman" w:cs="Times New Roman"/>
+          <w:b/>
+          <w:lang w:val="mn-MN"/>
+        </w:rPr>
+        <w:t xml:space="preserve"> </w:t>
       </w:r>
       <w:r>
         <w:rPr>
@@ -4636,7 +3667,21 @@
           <w:rFonts w:ascii="Times New Roman" w:hAnsi="Times New Roman" w:cs="Times New Roman"/>
           <w:lang w:val="mn-MN"/>
         </w:rPr>
-        <w:t xml:space="preserve">{{price}} </w:t>
+        <w:t>{{price</w:t>
+      </w:r>
+      <w:r>
+        <w:rPr>
+          <w:rFonts w:ascii="Times New Roman" w:hAnsi="Times New Roman" w:cs="Times New Roman"/>
+          <w:lang w:val="mn-MN"/>
+        </w:rPr>
+        <w:t>}}</w:t>
+      </w:r>
+      <w:r>
+        <w:rPr>
+          <w:rFonts w:ascii="Times New Roman" w:hAnsi="Times New Roman" w:cs="Times New Roman"/>
+          <w:lang w:val="mn-MN"/>
+        </w:rPr>
+        <w:t xml:space="preserve"> </w:t>
       </w:r>
       <w:r>
         <w:rPr>
@@ -4739,6 +3784,7 @@
           <w:rFonts w:ascii="Times New Roman" w:hAnsi="Times New Roman" w:cs="Times New Roman"/>
           <w:lang w:val="mn-MN"/>
         </w:rPr>
+        <w:lastRenderedPageBreak/>
         <w:t xml:space="preserve">Зуучлуулагчийн үл хөдлөх эд хөрөнгийг </w:t>
       </w:r>
       <w:r>
@@ -4785,7 +3831,7 @@
           <w:color w:val="000000" w:themeColor="text1"/>
           <w:lang w:val="mn-MN"/>
         </w:rPr>
-        <w:t xml:space="preserve">зуучилж өгсөн бол үл хөдлөх эд хөрөнгийн </w:t>
+        <w:t>зуучилж өгсөн бол үл хөдлөх эд хөрөнгийн 1 /Нэг/ сарын түрээс</w:t>
       </w:r>
       <w:r>
         <w:rPr>
@@ -4793,8 +3839,7 @@
           <w:color w:val="000000" w:themeColor="text1"/>
           <w:lang w:val="mn-MN"/>
         </w:rPr>
-        <w:lastRenderedPageBreak/>
-        <w:t>1 /Нэг/ сарын түрээс</w:t>
+        <w:t xml:space="preserve"> </w:t>
       </w:r>
       <w:r>
         <w:rPr>
@@ -4802,7 +3847,7 @@
           <w:color w:val="000000" w:themeColor="text1"/>
           <w:lang w:val="mn-MN"/>
         </w:rPr>
-        <w:t xml:space="preserve"> </w:t>
+        <w:t>{{price</w:t>
       </w:r>
       <w:r>
         <w:rPr>
@@ -4810,7 +3855,15 @@
           <w:color w:val="000000" w:themeColor="text1"/>
           <w:lang w:val="mn-MN"/>
         </w:rPr>
-        <w:t xml:space="preserve">{{price}}  </w:t>
+        <w:t>}}</w:t>
+      </w:r>
+      <w:r>
+        <w:rPr>
+          <w:rFonts w:ascii="Times New Roman" w:hAnsi="Times New Roman" w:cs="Times New Roman"/>
+          <w:color w:val="000000" w:themeColor="text1"/>
+          <w:lang w:val="mn-MN"/>
+        </w:rPr>
+        <w:t xml:space="preserve">  </w:t>
       </w:r>
       <w:r>
         <w:rPr>
@@ -5015,7 +4068,21 @@
           <w:rFonts w:ascii="Times New Roman" w:hAnsi="Times New Roman" w:cs="Times New Roman"/>
           <w:lang w:val="mn-MN"/>
         </w:rPr>
-        <w:t xml:space="preserve">{{price}}  </w:t>
+        <w:t>{{price</w:t>
+      </w:r>
+      <w:r>
+        <w:rPr>
+          <w:rFonts w:ascii="Times New Roman" w:hAnsi="Times New Roman" w:cs="Times New Roman"/>
+          <w:lang w:val="mn-MN"/>
+        </w:rPr>
+        <w:t>}}</w:t>
+      </w:r>
+      <w:r>
+        <w:rPr>
+          <w:rFonts w:ascii="Times New Roman" w:hAnsi="Times New Roman" w:cs="Times New Roman"/>
+          <w:lang w:val="mn-MN"/>
+        </w:rPr>
+        <w:t xml:space="preserve">  </w:t>
       </w:r>
       <w:r>
         <w:rPr>
@@ -7122,6 +6189,7 @@
           <w:bCs/>
           <w:lang w:val="mn-MN"/>
         </w:rPr>
+        <w:lastRenderedPageBreak/>
         <w:t>Энэхүү Г</w:t>
       </w:r>
       <w:r>
@@ -7219,7 +6287,6 @@
           <w:bCs/>
           <w:lang w:val="mn-MN"/>
         </w:rPr>
-        <w:lastRenderedPageBreak/>
         <w:t xml:space="preserve">Үл хөдлөх эд хөрөнгийг түрээслэх боломжит түрээслэгчийг олж өгөх зорилгоор Зуучлагч </w:t>
       </w:r>
       <w:r>
@@ -8687,6 +7754,7 @@
           <w:bCs/>
           <w:lang w:val="mn-MN"/>
         </w:rPr>
+        <w:lastRenderedPageBreak/>
         <w:t xml:space="preserve">Үл </w:t>
       </w:r>
       <w:r>
@@ -8719,7 +7787,6 @@
           <w:rFonts w:ascii="Times New Roman" w:hAnsi="Times New Roman" w:cs="Times New Roman"/>
           <w:lang w:val="mn-MN"/>
         </w:rPr>
-        <w:lastRenderedPageBreak/>
         <w:t xml:space="preserve">Энэхүү гэрээний хүчин төгөлдөр хугацаанд өөрийн үл хөдлөх хөрөнгийн хэвийн ашиглалтын нөхцөлийг хангах (ашиглалтын зардал, цахилгаан, дулаан, цэвэр бохир усны хэвийн ажиллагаа г.м) үүрэг хүлээнэ. </w:t>
       </w:r>
     </w:p>
@@ -10344,6 +9411,7 @@
           <w:rFonts w:ascii="Times New Roman" w:hAnsi="Times New Roman" w:cs="Times New Roman"/>
           <w:lang w:val="mn-MN"/>
         </w:rPr>
+        <w:lastRenderedPageBreak/>
         <w:t xml:space="preserve">Энэхүү Гэрээгээр зохицуулаагүй бусад харилцааг Гэрээ байгуулах үед Монгол Улсад хүчин төгөлдөр мөрдөж байсан хууль тогтоомжийн дагуу зохицуулна. </w:t>
       </w:r>
     </w:p>
@@ -10371,7 +9439,6 @@
           <w:rFonts w:ascii="Times New Roman" w:hAnsi="Times New Roman" w:cs="Times New Roman"/>
           <w:lang w:val="mn-MN"/>
         </w:rPr>
-        <w:lastRenderedPageBreak/>
         <w:t xml:space="preserve">Гэрээний аль нэг заалт хүчин төгөлдөр бусад тооцогдсон тохиолдолд тэрхүү заалтыг Монгол Улсын Иргэний Хуулийн тохирох заалтаар орлуулах ба Гэрээний үлдсэн заалтууд цаашид хүчин төгөлдөр хэвээр байна. </w:t>
       </w:r>
     </w:p>
@@ -10762,7 +9829,15 @@
           <w:bCs/>
           <w:lang w:val="mn-MN"/>
         </w:rPr>
-        <w:t>{{name}}</w:t>
+        <w:t>{{name</w:t>
+      </w:r>
+      <w:r>
+        <w:rPr>
+          <w:rFonts w:ascii="Times New Roman" w:hAnsi="Times New Roman" w:cs="Times New Roman"/>
+          <w:bCs/>
+          <w:lang w:val="mn-MN"/>
+        </w:rPr>
+        <w:t>}}</w:t>
       </w:r>
       <w:r>
         <w:rPr>
@@ -10854,7 +9929,15 @@
           <w:bCs/>
           <w:lang w:val="mn-MN"/>
         </w:rPr>
-        <w:t>{{register}}</w:t>
+        <w:t>{{register</w:t>
+      </w:r>
+      <w:r>
+        <w:rPr>
+          <w:rFonts w:ascii="Times New Roman" w:hAnsi="Times New Roman" w:cs="Times New Roman"/>
+          <w:bCs/>
+          <w:lang w:val="mn-MN"/>
+        </w:rPr>
+        <w:t>}}</w:t>
       </w:r>
     </w:p>
     <w:p>
@@ -10892,7 +9975,15 @@
           <w:bCs/>
           <w:lang w:val="mn-MN"/>
         </w:rPr>
-        <w:t>{{register}}</w:t>
+        <w:t>{{register</w:t>
+      </w:r>
+      <w:r>
+        <w:rPr>
+          <w:rFonts w:ascii="Times New Roman" w:hAnsi="Times New Roman" w:cs="Times New Roman"/>
+          <w:bCs/>
+          <w:lang w:val="mn-MN"/>
+        </w:rPr>
+        <w:t>}}</w:t>
       </w:r>
     </w:p>
     <w:p>
@@ -10922,7 +10013,15 @@
           <w:bCs/>
           <w:lang w:val="mn-MN"/>
         </w:rPr>
-        <w:t>{{register}}</w:t>
+        <w:t>{{register</w:t>
+      </w:r>
+      <w:r>
+        <w:rPr>
+          <w:rFonts w:ascii="Times New Roman" w:hAnsi="Times New Roman" w:cs="Times New Roman"/>
+          <w:bCs/>
+          <w:lang w:val="mn-MN"/>
+        </w:rPr>
+        <w:t>}}</w:t>
       </w:r>
     </w:p>
     <w:p>
@@ -10960,7 +10059,15 @@
           <w:bCs/>
           <w:lang w:val="mn-MN"/>
         </w:rPr>
-        <w:t>{{register}}</w:t>
+        <w:t>{{register</w:t>
+      </w:r>
+      <w:r>
+        <w:rPr>
+          <w:rFonts w:ascii="Times New Roman" w:hAnsi="Times New Roman" w:cs="Times New Roman"/>
+          <w:bCs/>
+          <w:lang w:val="mn-MN"/>
+        </w:rPr>
+        <w:t>}}</w:t>
       </w:r>
     </w:p>
     <w:p>
@@ -11145,7 +10252,15 @@
           <w:bCs/>
           <w:lang w:val="mn-MN"/>
         </w:rPr>
-        <w:t>{{register2}}</w:t>
+        <w:t>{{register2</w:t>
+      </w:r>
+      <w:r>
+        <w:rPr>
+          <w:rFonts w:ascii="Times New Roman" w:hAnsi="Times New Roman" w:cs="Times New Roman"/>
+          <w:bCs/>
+          <w:lang w:val="mn-MN"/>
+        </w:rPr>
+        <w:t>}}</w:t>
       </w:r>
     </w:p>
     <w:p>
@@ -11377,17 +10492,8 @@
           <w:rFonts w:ascii="Times New Roman" w:hAnsi="Times New Roman" w:cs="Times New Roman"/>
           <w:bCs/>
         </w:rPr>
-        <w:t xml:space="preserve">J Tower 908 </w:t>
-      </w:r>
-      <w:proofErr w:type="spellStart"/>
-      <w:r>
-        <w:rPr>
-          <w:rFonts w:ascii="Times New Roman" w:hAnsi="Times New Roman" w:cs="Times New Roman"/>
-          <w:bCs/>
-        </w:rPr>
-        <w:t>тоот</w:t>
-      </w:r>
-      <w:proofErr w:type="spellEnd"/>
+        <w:t>J Tower 908 тоот</w:t>
+      </w:r>
       <w:r>
         <w:rPr>
           <w:rFonts w:ascii="Times New Roman" w:hAnsi="Times New Roman" w:cs="Times New Roman"/>
@@ -11500,7 +10606,15 @@
           <w:bCs/>
           <w:lang w:val="mn-MN"/>
         </w:rPr>
-        <w:t>{{agent}}</w:t>
+        <w:t>{{agent</w:t>
+      </w:r>
+      <w:r>
+        <w:rPr>
+          <w:rFonts w:ascii="Times New Roman" w:hAnsi="Times New Roman" w:cs="Times New Roman"/>
+          <w:bCs/>
+          <w:lang w:val="mn-MN"/>
+        </w:rPr>
+        <w:t>}}</w:t>
       </w:r>
       <w:r>
         <w:rPr>

</xml_diff>